<commit_message>
Add ownership test cases, reconcile compliance catalogue, mark example defect
</commit_message>
<xml_diff>
--- a/docs/testing/PropertyOS_Alpha_Test_Strategy.docx
+++ b/docs/testing/PropertyOS_Alpha_Test_Strategy.docx
@@ -211,6 +211,14 @@
         <w:pStyle w:val="ListBullet"/>
       </w:pPr>
       <w:r>
+        <w:t>Ownership: entity type (individual, joint, limited company, trust, partnership), single or multiple owners per property, ownership percentage validation (must sum to 100%)</w:t>
+      </w:r>
+    </w:p>
+    <w:p>
+      <w:pPr>
+        <w:pStyle w:val="ListBullet"/>
+      </w:pPr>
+      <w:r>
         <w:t>Tenancies: current/historical dates, rent, payment day, tenant display name/initials, data-minimisation checks</w:t>
       </w:r>
     </w:p>
@@ -219,7 +227,7 @@
         <w:pStyle w:val="ListBullet"/>
       </w:pPr>
       <w:r>
-        <w:t>Compliance: requirement catalogue, records, all six statuses, dates, source document linkage</w:t>
+        <w:t>Compliance: requirement catalogue (nine default categories including Fire Risk Assessment, plus organisation-defined custom requirements), records, all six statuses, dates, source document linkage</w:t>
       </w:r>
     </w:p>
     <w:p>
@@ -1284,6 +1292,38 @@
           </w:tcPr>
           <w:p>
             <w:r>
+              <w:t>Ownership percentage splits are wrong or don't sum to 100%, misattributing legal responsibility for a property</w:t>
+            </w:r>
+          </w:p>
+        </w:tc>
+        <w:tc>
+          <w:tcPr>
+            <w:tcW w:type="dxa" w:w="4535"/>
+          </w:tcPr>
+          <w:p>
+            <w:r>
+              <w:t>Validation tests across all entity types (individual, joint, limited company, trust, partnership) and multi-owner splits</w:t>
+            </w:r>
+          </w:p>
+        </w:tc>
+      </w:tr>
+      <w:tr>
+        <w:tc>
+          <w:tcPr>
+            <w:tcW w:type="dxa" w:w="1417"/>
+          </w:tcPr>
+          <w:p>
+            <w:r>
+              <w:t>High</w:t>
+            </w:r>
+          </w:p>
+        </w:tc>
+        <w:tc>
+          <w:tcPr>
+            <w:tcW w:type="dxa" w:w="3402"/>
+          </w:tcPr>
+          <w:p>
+            <w:r>
               <w:t>AI silently changes a compliance record</w:t>
             </w:r>
           </w:p>
@@ -1326,7 +1366,7 @@
           </w:tcPr>
           <w:p>
             <w:r>
-              <w:t>Locale checks on every screen; catalogue matches the eight default categories exactly</w:t>
+              <w:t>Locale checks on every screen; catalogue matches the agreed default categories (including Fire Risk Assessment) and supports organisation-defined custom requirements without breaking Today calculations</w:t>
             </w:r>
           </w:p>
         </w:tc>

</xml_diff>